<commit_message>
release(p5): approved R6 30 files at 29900 RUB, P12 consolidated
</commit_message>
<xml_diff>
--- a/products-storage/07-uderzhaniya-shtrafy-zachety/01-pretenziya-na-uderzhanie.docx
+++ b/products-storage/07-uderzhaniya-shtrafy-zachety/01-pretenziya-na-uderzhanie.docx
@@ -2,240 +2,611 @@
 <file path=word/document.xml><?xml version="1.0" encoding="utf-8"?>
 <w:document xmlns:wpc="http://schemas.microsoft.com/office/word/2010/wordprocessingCanvas" xmlns:mo="http://schemas.microsoft.com/office/mac/office/2008/main" xmlns:mc="http://schemas.openxmlformats.org/markup-compatibility/2006" xmlns:mv="urn:schemas-microsoft-com:mac:vml" xmlns:o="urn:schemas-microsoft-com:office:office" xmlns:r="http://schemas.openxmlformats.org/officeDocument/2006/relationships" xmlns:m="http://schemas.openxmlformats.org/officeDocument/2006/math" xmlns:v="urn:schemas-microsoft-com:vml" xmlns:wp14="http://schemas.microsoft.com/office/word/2010/wordprocessingDrawing" xmlns:wp="http://schemas.openxmlformats.org/drawingml/2006/wordprocessingDrawing" xmlns:w10="urn:schemas-microsoft-com:office:word" xmlns:w="http://schemas.openxmlformats.org/wordprocessingml/2006/main" xmlns:w14="http://schemas.microsoft.com/office/word/2010/wordml" xmlns:wpg="http://schemas.microsoft.com/office/word/2010/wordprocessingGroup" xmlns:wpi="http://schemas.microsoft.com/office/word/2010/wordprocessingInk" xmlns:wne="http://schemas.microsoft.com/office/word/2006/wordml" xmlns:wps="http://schemas.microsoft.com/office/word/2010/wordprocessingShape" mc:Ignorable="w14 wp14">
   <w:body>
+    <w:tbl>
+      <w:tblPr>
+        <w:tblW w:type="auto" w:w="0"/>
+        <w:tblLayout w:type="fixed"/>
+        <w:tblLook w:firstColumn="1" w:firstRow="1" w:lastColumn="0" w:lastRow="0" w:noHBand="0" w:noVBand="1" w:val="04A0"/>
+        <w:tblBorders>
+          <w:top w:val="nil"/>
+          <w:left w:val="nil"/>
+          <w:bottom w:val="nil"/>
+          <w:right w:val="nil"/>
+          <w:insideH w:val="nil"/>
+          <w:insideV w:val="nil"/>
+        </w:tblBorders>
+      </w:tblPr>
+      <w:tblGrid>
+        <w:gridCol w:w="4025"/>
+        <w:gridCol w:w="5272"/>
+      </w:tblGrid>
+      <w:tr>
+        <w:tc>
+          <w:tcPr>
+            <w:tcW w:type="dxa" w:w="4025"/>
+            <w:vAlign w:val="top"/>
+          </w:tcPr>
+          <w:p>
+            <w:pPr>
+              <w:spacing w:after="40" w:line="259" w:lineRule="auto"/>
+            </w:pPr>
+            <w:r>
+              <w:rPr>
+                <w:rFonts w:ascii="Arial" w:hAnsi="Arial"/>
+                <w:color w:val="262F37"/>
+                <w:sz w:val="18"/>
+              </w:rPr>
+              <w:t>[На бланке организации]</w:t>
+            </w:r>
+          </w:p>
+          <w:p>
+            <w:pPr>
+              <w:spacing w:after="40" w:line="259" w:lineRule="auto"/>
+            </w:pPr>
+            <w:r>
+              <w:rPr>
+                <w:rFonts w:ascii="Arial" w:hAnsi="Arial"/>
+                <w:color w:val="262F37"/>
+                <w:sz w:val="18"/>
+              </w:rPr>
+              <w:t>Исх. № _____ от '___' ___________ 20___ г.</w:t>
+            </w:r>
+          </w:p>
+        </w:tc>
+        <w:tc>
+          <w:tcPr>
+            <w:tcW w:type="dxa" w:w="5272"/>
+            <w:vAlign w:val="top"/>
+          </w:tcPr>
+          <w:p>
+            <w:pPr>
+              <w:spacing w:after="40" w:line="259" w:lineRule="auto"/>
+              <w:jc w:val="left"/>
+            </w:pPr>
+            <w:r>
+              <w:rPr>
+                <w:rFonts w:ascii="Arial" w:hAnsi="Arial"/>
+                <w:color w:val="262F37"/>
+                <w:sz w:val="18"/>
+              </w:rPr>
+              <w:t>Генеральному директору</w:t>
+            </w:r>
+          </w:p>
+          <w:p>
+            <w:pPr>
+              <w:spacing w:after="40" w:line="259" w:lineRule="auto"/>
+              <w:jc w:val="left"/>
+            </w:pPr>
+            <w:r>
+              <w:rPr>
+                <w:rFonts w:ascii="Arial" w:hAnsi="Arial"/>
+                <w:color w:val="262F37"/>
+                <w:sz w:val="18"/>
+              </w:rPr>
+              <w:t>[Наименование заказчика]</w:t>
+            </w:r>
+          </w:p>
+          <w:p>
+            <w:pPr>
+              <w:spacing w:after="40" w:line="259" w:lineRule="auto"/>
+              <w:jc w:val="left"/>
+            </w:pPr>
+            <w:r>
+              <w:rPr>
+                <w:rFonts w:ascii="Arial" w:hAnsi="Arial"/>
+                <w:color w:val="262F37"/>
+                <w:sz w:val="18"/>
+              </w:rPr>
+              <w:t>[ФИО руководителя]</w:t>
+            </w:r>
+          </w:p>
+          <w:p>
+            <w:pPr>
+              <w:spacing w:after="40" w:line="259" w:lineRule="auto" w:before="80"/>
+              <w:jc w:val="left"/>
+            </w:pPr>
+            <w:r>
+              <w:rPr>
+                <w:rFonts w:ascii="Arial" w:hAnsi="Arial"/>
+                <w:color w:val="262F37"/>
+                <w:sz w:val="18"/>
+              </w:rPr>
+              <w:t>От [Наименование подрядчика]</w:t>
+            </w:r>
+          </w:p>
+        </w:tc>
+      </w:tr>
+    </w:tbl>
     <w:p>
       <w:pPr>
-        <w:pStyle w:val="Title"/>
+        <w:keepNext/>
+        <w:keepLines/>
+        <w:widowControl/>
+        <w:spacing w:before="240" w:after="80" w:line="271" w:lineRule="auto"/>
         <w:jc w:val="center"/>
+        <w:pBdr>
+          <w:bottom w:val="single" w:sz="8" w:color="8E6F32" w:space="5"/>
+        </w:pBdr>
       </w:pPr>
       <w:r>
-        <w:t>ПРЕТЕНЗИЯ на неправомерное удержание сумм по договору подряда</w:t>
-      </w:r>
-    </w:p>
-    <w:p/>
-    <w:p>
-      <w:r>
-        <w:t>[На бланке организации]</w:t>
-      </w:r>
-    </w:p>
-    <w:p/>
-    <w:p>
-      <w:r>
-        <w:t>Исх. № _____ от '___' ___________ 20___ г.</w:t>
-      </w:r>
-    </w:p>
-    <w:p/>
-    <w:p>
-      <w:r>
-        <w:t>Генеральному директору</w:t>
-      </w:r>
-    </w:p>
-    <w:p>
-      <w:r>
-        <w:t>[Наименование заказчика]</w:t>
-      </w:r>
-    </w:p>
-    <w:p>
-      <w:r>
-        <w:t>[ФИО руководителя]</w:t>
-      </w:r>
-    </w:p>
-    <w:p/>
-    <w:p>
-      <w:r>
-        <w:t>От [Наименование подрядчика]</w:t>
-      </w:r>
-    </w:p>
-    <w:p/>
-    <w:p>
-      <w:r>
+        <w:rPr>
+          <w:rFonts w:ascii="Arial" w:hAnsi="Arial" w:eastAsia="Arial" w:cs="Arial"/>
+          <w:b/>
+          <w:i w:val="0"/>
+          <w:color w:val="262F37"/>
+          <w:sz w:val="28"/>
+        </w:rPr>
         <w:t>ПРЕТЕНЗИЯ</w:t>
       </w:r>
     </w:p>
     <w:p>
+      <w:pPr>
+        <w:keepNext/>
+        <w:widowControl/>
+        <w:spacing w:before="0" w:after="80" w:line="271" w:lineRule="auto"/>
+        <w:jc w:val="center"/>
+      </w:pPr>
       <w:r>
+        <w:rPr>
+          <w:rFonts w:ascii="Arial" w:hAnsi="Arial" w:eastAsia="Arial" w:cs="Arial"/>
+          <w:b/>
+          <w:i w:val="0"/>
+          <w:color w:val="262F37"/>
+          <w:sz w:val="20"/>
+        </w:rPr>
         <w:t>о взыскании неправомерно удержанных сумм</w:t>
       </w:r>
     </w:p>
-    <w:p/>
     <w:p>
+      <w:pPr>
+        <w:widowControl/>
+        <w:spacing w:before="0" w:after="80" w:line="271" w:lineRule="auto"/>
+      </w:pPr>
       <w:r>
+        <w:rPr>
+          <w:rFonts w:ascii="Arial" w:hAnsi="Arial" w:eastAsia="Arial" w:cs="Arial"/>
+          <w:i w:val="0"/>
+          <w:color w:val="31363C"/>
+          <w:sz w:val="21"/>
+        </w:rPr>
         <w:t>Уважаемый [ФИО]!</w:t>
       </w:r>
     </w:p>
-    <w:p/>
     <w:p>
+      <w:pPr>
+        <w:widowControl/>
+        <w:spacing w:before="0" w:after="80" w:line="271" w:lineRule="auto"/>
+      </w:pPr>
       <w:r>
+        <w:rPr>
+          <w:rFonts w:ascii="Arial" w:hAnsi="Arial" w:eastAsia="Arial" w:cs="Arial"/>
+          <w:i w:val="0"/>
+          <w:color w:val="31363C"/>
+          <w:sz w:val="21"/>
+        </w:rPr>
         <w:t>Настоящим сообщаем, что в нарушение п. [номер] договора подряда № [номер] от [дата] (далее - Договор) Заказчиком неправомерно удержаны средства в размере [сумма] руб.</w:t>
       </w:r>
     </w:p>
-    <w:p/>
     <w:p>
+      <w:pPr>
+        <w:keepNext/>
+        <w:widowControl/>
+        <w:spacing w:before="140" w:after="80" w:line="271" w:lineRule="auto"/>
+      </w:pPr>
       <w:r>
+        <w:rPr>
+          <w:rFonts w:ascii="Arial" w:hAnsi="Arial" w:eastAsia="Arial" w:cs="Arial"/>
+          <w:i w:val="0"/>
+          <w:color w:val="31363C"/>
+          <w:sz w:val="21"/>
+        </w:rPr>
         <w:t>1. ОБСТОЯТЕЛЬСТВА ДЕЛА:</w:t>
       </w:r>
     </w:p>
     <w:p>
+      <w:pPr>
+        <w:widowControl/>
+        <w:spacing w:before="0" w:after="80" w:line="271" w:lineRule="auto"/>
+      </w:pPr>
       <w:r>
+        <w:rPr>
+          <w:rFonts w:ascii="Arial" w:hAnsi="Arial" w:eastAsia="Arial" w:cs="Arial"/>
+          <w:i w:val="0"/>
+          <w:color w:val="31363C"/>
+          <w:sz w:val="21"/>
+        </w:rPr>
         <w:t xml:space="preserve">   - КС-2 № _____ от _____ на сумму _____ руб. подписана обеими сторонами.</w:t>
       </w:r>
     </w:p>
     <w:p>
+      <w:pPr>
+        <w:widowControl/>
+        <w:spacing w:before="0" w:after="80" w:line="271" w:lineRule="auto"/>
+      </w:pPr>
       <w:r>
+        <w:rPr>
+          <w:rFonts w:ascii="Arial" w:hAnsi="Arial" w:eastAsia="Arial" w:cs="Arial"/>
+          <w:i w:val="0"/>
+          <w:color w:val="31363C"/>
+          <w:sz w:val="21"/>
+        </w:rPr>
         <w:t xml:space="preserve">   - Крайний срок оплаты: _____.</w:t>
       </w:r>
     </w:p>
     <w:p>
+      <w:pPr>
+        <w:widowControl/>
+        <w:spacing w:before="0" w:after="80" w:line="271" w:lineRule="auto"/>
+      </w:pPr>
       <w:r>
+        <w:rPr>
+          <w:rFonts w:ascii="Arial" w:hAnsi="Arial" w:eastAsia="Arial" w:cs="Arial"/>
+          <w:i w:val="0"/>
+          <w:color w:val="31363C"/>
+          <w:sz w:val="21"/>
+        </w:rPr>
         <w:t xml:space="preserve">   - Фактически оплачено: _____ руб.</w:t>
       </w:r>
     </w:p>
     <w:p>
+      <w:pPr>
+        <w:widowControl/>
+        <w:spacing w:before="0" w:after="80" w:line="271" w:lineRule="auto"/>
+      </w:pPr>
       <w:r>
+        <w:rPr>
+          <w:rFonts w:ascii="Arial" w:hAnsi="Arial" w:eastAsia="Arial" w:cs="Arial"/>
+          <w:i w:val="0"/>
+          <w:color w:val="31363C"/>
+          <w:sz w:val="21"/>
+        </w:rPr>
         <w:t xml:space="preserve">   - Удержано без согласования: _____ руб.</w:t>
       </w:r>
     </w:p>
     <w:p>
+      <w:pPr>
+        <w:widowControl/>
+        <w:spacing w:before="0" w:after="80" w:line="271" w:lineRule="auto"/>
+      </w:pPr>
       <w:r>
+        <w:rPr>
+          <w:rFonts w:ascii="Arial" w:hAnsi="Arial" w:eastAsia="Arial" w:cs="Arial"/>
+          <w:i w:val="0"/>
+          <w:color w:val="31363C"/>
+          <w:sz w:val="21"/>
+        </w:rPr>
         <w:t xml:space="preserve">   - Основание удержания (со слов Заказчика): _______________________________</w:t>
       </w:r>
     </w:p>
-    <w:p/>
     <w:p>
+      <w:pPr>
+        <w:keepNext/>
+        <w:widowControl/>
+        <w:spacing w:before="140" w:after="80" w:line="271" w:lineRule="auto"/>
+      </w:pPr>
       <w:r>
+        <w:rPr>
+          <w:rFonts w:ascii="Arial" w:hAnsi="Arial" w:eastAsia="Arial" w:cs="Arial"/>
+          <w:i w:val="0"/>
+          <w:color w:val="31363C"/>
+          <w:sz w:val="21"/>
+        </w:rPr>
         <w:t>2. ПРАВОВОЕ ОБОСНОВАНИЕ:</w:t>
       </w:r>
     </w:p>
     <w:p>
+      <w:pPr>
+        <w:widowControl/>
+        <w:spacing w:before="0" w:after="80" w:line="271" w:lineRule="auto"/>
+      </w:pPr>
       <w:r>
+        <w:rPr>
+          <w:rFonts w:ascii="Arial" w:hAnsi="Arial" w:eastAsia="Arial" w:cs="Arial"/>
+          <w:i w:val="0"/>
+          <w:color w:val="31363C"/>
+          <w:sz w:val="21"/>
+        </w:rPr>
         <w:t xml:space="preserve">   Согласно ст. 310 ГК РФ односторонний отказ от исполнения обязательства и одностороннее изменение его условий не допускаются, за исключением случаев, предусмотренных законом.</w:t>
       </w:r>
     </w:p>
-    <w:p/>
     <w:p>
+      <w:pPr>
+        <w:widowControl/>
+        <w:spacing w:before="0" w:after="80" w:line="271" w:lineRule="auto"/>
+      </w:pPr>
       <w:r>
+        <w:rPr>
+          <w:rFonts w:ascii="Arial" w:hAnsi="Arial" w:eastAsia="Arial" w:cs="Arial"/>
+          <w:i w:val="0"/>
+          <w:color w:val="31363C"/>
+          <w:sz w:val="21"/>
+        </w:rPr>
         <w:t xml:space="preserve">   Согласно п. 1 ст. 711 ГК РФ заказчик обязан уплатить подрядчику обусловленную цену после окончательной сдачи результатов работы при условии, что работа выполнена надлежащим образом и в согласованный срок. Порядок оплаты работ по договору строительного подряда установлен ст. 746 ГК РФ.</w:t>
       </w:r>
     </w:p>
-    <w:p/>
     <w:p>
+      <w:pPr>
+        <w:widowControl/>
+        <w:spacing w:before="0" w:after="80" w:line="271" w:lineRule="auto"/>
+      </w:pPr>
       <w:r>
+        <w:rPr>
+          <w:rFonts w:ascii="Arial" w:hAnsi="Arial" w:eastAsia="Arial" w:cs="Arial"/>
+          <w:i w:val="0"/>
+          <w:color w:val="31363C"/>
+          <w:sz w:val="21"/>
+        </w:rPr>
         <w:t xml:space="preserve">   Удержание сумм без письменного согласования подрядчика является нарушением Договора и правомерных интересов Подрядчика.</w:t>
       </w:r>
     </w:p>
-    <w:p/>
     <w:p>
+      <w:pPr>
+        <w:keepNext/>
+        <w:widowControl/>
+        <w:spacing w:before="140" w:after="80" w:line="271" w:lineRule="auto"/>
+      </w:pPr>
       <w:r>
+        <w:rPr>
+          <w:rFonts w:ascii="Arial" w:hAnsi="Arial" w:eastAsia="Arial" w:cs="Arial"/>
+          <w:i w:val="0"/>
+          <w:color w:val="31363C"/>
+          <w:sz w:val="21"/>
+        </w:rPr>
         <w:t>3. ТРЕБОВАНИЯ:</w:t>
       </w:r>
     </w:p>
     <w:p>
+      <w:pPr>
+        <w:widowControl/>
+        <w:spacing w:before="0" w:after="80" w:line="271" w:lineRule="auto"/>
+      </w:pPr>
       <w:r>
+        <w:rPr>
+          <w:rFonts w:ascii="Arial" w:hAnsi="Arial" w:eastAsia="Arial" w:cs="Arial"/>
+          <w:i w:val="0"/>
+          <w:color w:val="31363C"/>
+          <w:sz w:val="21"/>
+        </w:rPr>
         <w:t xml:space="preserve">   В срок до [дата] произвести оплату удержанной суммы в размере [сумма] руб.</w:t>
       </w:r>
     </w:p>
-    <w:p/>
     <w:p>
+      <w:pPr>
+        <w:widowControl/>
+        <w:spacing w:before="0" w:after="80" w:line="271" w:lineRule="auto"/>
+      </w:pPr>
       <w:r>
+        <w:rPr>
+          <w:rFonts w:ascii="Arial" w:hAnsi="Arial" w:eastAsia="Arial" w:cs="Arial"/>
+          <w:i w:val="0"/>
+          <w:color w:val="31363C"/>
+          <w:sz w:val="21"/>
+        </w:rPr>
         <w:t xml:space="preserve">   В случае неудовлетворения претензии оставляем за собой право обратиться в арбитражный суд с исковым требованием о взыскании:</w:t>
       </w:r>
     </w:p>
     <w:p>
       <w:pPr>
         <w:pStyle w:val="ListBullet"/>
+        <w:widowControl/>
+        <w:spacing w:before="0" w:after="80" w:line="271" w:lineRule="auto"/>
       </w:pPr>
       <w:r>
+        <w:rPr>
+          <w:rFonts w:ascii="Arial" w:hAnsi="Arial" w:eastAsia="Arial" w:cs="Arial"/>
+          <w:i w:val="0"/>
+          <w:color w:val="31363C"/>
+          <w:sz w:val="21"/>
+        </w:rPr>
         <w:t>удержанной суммы - [сумма] руб.,</w:t>
       </w:r>
     </w:p>
     <w:p>
       <w:pPr>
         <w:pStyle w:val="ListBullet"/>
+        <w:widowControl/>
+        <w:spacing w:before="0" w:after="80" w:line="271" w:lineRule="auto"/>
       </w:pPr>
       <w:r>
+        <w:rPr>
+          <w:rFonts w:ascii="Arial" w:hAnsi="Arial" w:eastAsia="Arial" w:cs="Arial"/>
+          <w:i w:val="0"/>
+          <w:color w:val="31363C"/>
+          <w:sz w:val="21"/>
+        </w:rPr>
         <w:t>неустойки по договору - [сумма] руб.,</w:t>
       </w:r>
     </w:p>
     <w:p>
       <w:pPr>
         <w:pStyle w:val="ListBullet"/>
+        <w:widowControl/>
+        <w:spacing w:before="0" w:after="80" w:line="271" w:lineRule="auto"/>
       </w:pPr>
       <w:r>
+        <w:rPr>
+          <w:rFonts w:ascii="Arial" w:hAnsi="Arial" w:eastAsia="Arial" w:cs="Arial"/>
+          <w:i w:val="0"/>
+          <w:color w:val="31363C"/>
+          <w:sz w:val="21"/>
+        </w:rPr>
         <w:t>процентов по ст. 395 ГК РФ - [сумма] руб.,</w:t>
       </w:r>
     </w:p>
     <w:p>
       <w:pPr>
         <w:pStyle w:val="ListBullet"/>
+        <w:widowControl/>
+        <w:spacing w:before="0" w:after="80" w:line="271" w:lineRule="auto"/>
       </w:pPr>
       <w:r>
+        <w:rPr>
+          <w:rFonts w:ascii="Arial" w:hAnsi="Arial" w:eastAsia="Arial" w:cs="Arial"/>
+          <w:i w:val="0"/>
+          <w:color w:val="31363C"/>
+          <w:sz w:val="21"/>
+        </w:rPr>
         <w:t>судебных расходов.</w:t>
       </w:r>
     </w:p>
-    <w:p/>
     <w:p>
+      <w:pPr>
+        <w:keepNext/>
+        <w:widowControl/>
+        <w:spacing w:before="140" w:after="80" w:line="271" w:lineRule="auto"/>
+      </w:pPr>
       <w:r>
+        <w:rPr>
+          <w:rFonts w:ascii="Arial" w:hAnsi="Arial" w:eastAsia="Arial" w:cs="Arial"/>
+          <w:i w:val="0"/>
+          <w:color w:val="31363C"/>
+          <w:sz w:val="21"/>
+        </w:rPr>
         <w:t>4. ПРИЛОЖЕНИЯ:</w:t>
       </w:r>
     </w:p>
     <w:p>
       <w:pPr>
         <w:pStyle w:val="ListBullet"/>
+        <w:widowControl/>
+        <w:spacing w:before="0" w:after="80" w:line="271" w:lineRule="auto"/>
       </w:pPr>
       <w:r>
+        <w:rPr>
+          <w:rFonts w:ascii="Arial" w:hAnsi="Arial" w:eastAsia="Arial" w:cs="Arial"/>
+          <w:i w:val="0"/>
+          <w:color w:val="31363C"/>
+          <w:sz w:val="21"/>
+        </w:rPr>
         <w:t>Копия договора подряда (л. __)</w:t>
       </w:r>
     </w:p>
     <w:p>
       <w:pPr>
         <w:pStyle w:val="ListBullet"/>
+        <w:widowControl/>
+        <w:spacing w:before="0" w:after="80" w:line="271" w:lineRule="auto"/>
       </w:pPr>
       <w:r>
+        <w:rPr>
+          <w:rFonts w:ascii="Arial" w:hAnsi="Arial" w:eastAsia="Arial" w:cs="Arial"/>
+          <w:i w:val="0"/>
+          <w:color w:val="31363C"/>
+          <w:sz w:val="21"/>
+        </w:rPr>
         <w:t>Копия КС-2 (л. __)</w:t>
       </w:r>
     </w:p>
     <w:p>
       <w:pPr>
         <w:pStyle w:val="ListBullet"/>
+        <w:widowControl/>
+        <w:spacing w:before="0" w:after="80" w:line="271" w:lineRule="auto"/>
       </w:pPr>
       <w:r>
+        <w:rPr>
+          <w:rFonts w:ascii="Arial" w:hAnsi="Arial" w:eastAsia="Arial" w:cs="Arial"/>
+          <w:i w:val="0"/>
+          <w:color w:val="31363C"/>
+          <w:sz w:val="21"/>
+        </w:rPr>
         <w:t>Копия КС-3 (л. __)</w:t>
       </w:r>
     </w:p>
     <w:p>
       <w:pPr>
         <w:pStyle w:val="ListBullet"/>
+        <w:widowControl/>
+        <w:spacing w:before="0" w:after="80" w:line="271" w:lineRule="auto"/>
       </w:pPr>
       <w:r>
+        <w:rPr>
+          <w:rFonts w:ascii="Arial" w:hAnsi="Arial" w:eastAsia="Arial" w:cs="Arial"/>
+          <w:i w:val="0"/>
+          <w:color w:val="31363C"/>
+          <w:sz w:val="21"/>
+        </w:rPr>
         <w:t>Выписка из банка об удержании (л. __)</w:t>
       </w:r>
     </w:p>
     <w:p>
       <w:pPr>
         <w:pStyle w:val="ListBullet"/>
+        <w:widowControl/>
+        <w:spacing w:before="0" w:after="80" w:line="271" w:lineRule="auto"/>
       </w:pPr>
       <w:r>
+        <w:rPr>
+          <w:rFonts w:ascii="Arial" w:hAnsi="Arial" w:eastAsia="Arial" w:cs="Arial"/>
+          <w:i w:val="0"/>
+          <w:color w:val="31363C"/>
+          <w:sz w:val="21"/>
+        </w:rPr>
         <w:t>Расчет удержанной суммы (л. __).</w:t>
       </w:r>
     </w:p>
-    <w:p/>
     <w:p>
+      <w:pPr>
+        <w:keepNext/>
+        <w:widowControl/>
+        <w:spacing w:before="160" w:after="0" w:line="271" w:lineRule="auto"/>
+      </w:pPr>
       <w:r>
+        <w:rPr>
+          <w:rFonts w:ascii="Arial" w:hAnsi="Arial" w:eastAsia="Arial" w:cs="Arial"/>
+          <w:i w:val="0"/>
+          <w:color w:val="31363C"/>
+          <w:sz w:val="21"/>
+        </w:rPr>
         <w:t>Генеральный директор _________________ [ФИО]</w:t>
       </w:r>
     </w:p>
     <w:p>
+      <w:pPr>
+        <w:keepNext w:val="0"/>
+        <w:widowControl/>
+        <w:spacing w:before="0" w:after="0" w:line="271" w:lineRule="auto"/>
+      </w:pPr>
       <w:r>
+        <w:rPr>
+          <w:rFonts w:ascii="Arial" w:hAnsi="Arial" w:eastAsia="Arial" w:cs="Arial"/>
+          <w:i w:val="0"/>
+          <w:color w:val="31363C"/>
+          <w:sz w:val="21"/>
+        </w:rPr>
         <w:t>М.П.</w:t>
       </w:r>
     </w:p>
     <w:sectPr>
-      <w:pgSz w:w="12240" w:h="15840"/>
-      <w:pgMar w:top="1440" w:right="1800" w:bottom="1440" w:left="1800" w:header="720" w:footer="720" w:gutter="0"/>
+      <w:headerReference w:type="default" r:id="rId9"/>
+      <w:footerReference w:type="default" r:id="rId10"/>
+      <w:pgSz w:w="11906" w:h="16838"/>
+      <w:pgMar w:top="1134" w:right="1304" w:bottom="1134" w:left="1304" w:header="425" w:footer="454" w:gutter="0"/>
       <w:cols w:space="720"/>
       <w:docGrid w:linePitch="360"/>
     </w:sectPr>
   </w:body>
 </w:document>
+</file>
+
+<file path=word/footer1.xml><?xml version="1.0" encoding="utf-8"?>
+<w:ftr xmlns:m="http://schemas.openxmlformats.org/officeDocument/2006/math" xmlns:mc="http://schemas.openxmlformats.org/markup-compatibility/2006" xmlns:mo="http://schemas.microsoft.com/office/mac/office/2008/main" xmlns:mv="urn:schemas-microsoft-com:mac:vml" xmlns:o="urn:schemas-microsoft-com:office:office" xmlns:r="http://schemas.openxmlformats.org/officeDocument/2006/relationships" xmlns:v="urn:schemas-microsoft-com:vml" xmlns:w10="urn:schemas-microsoft-com:office:word" xmlns:w14="http://schemas.microsoft.com/office/word/2010/wordml" xmlns:w="http://schemas.openxmlformats.org/wordprocessingml/2006/main" xmlns:wne="http://schemas.microsoft.com/office/word/2006/wordml" xmlns:wp14="http://schemas.microsoft.com/office/word/2010/wordprocessingDrawing" xmlns:wp="http://schemas.openxmlformats.org/drawingml/2006/wordprocessingDrawing" xmlns:wpc="http://schemas.microsoft.com/office/word/2010/wordprocessingCanvas" xmlns:wpg="http://schemas.microsoft.com/office/word/2010/wordprocessingGroup" xmlns:wpi="http://schemas.microsoft.com/office/word/2010/wordprocessingInk" xmlns:wps="http://schemas.microsoft.com/office/word/2010/wordprocessingShape" mc:Ignorable="w14 wp14">
+  <w:p>
+    <w:pPr>
+      <w:pStyle w:val="Footer"/>
+    </w:pPr>
+  </w:p>
+</w:ftr>
+</file>
+
+<file path=word/header1.xml><?xml version="1.0" encoding="utf-8"?>
+<w:hdr xmlns:m="http://schemas.openxmlformats.org/officeDocument/2006/math" xmlns:mc="http://schemas.openxmlformats.org/markup-compatibility/2006" xmlns:mo="http://schemas.microsoft.com/office/mac/office/2008/main" xmlns:mv="urn:schemas-microsoft-com:mac:vml" xmlns:o="urn:schemas-microsoft-com:office:office" xmlns:r="http://schemas.openxmlformats.org/officeDocument/2006/relationships" xmlns:v="urn:schemas-microsoft-com:vml" xmlns:w10="urn:schemas-microsoft-com:office:word" xmlns:w14="http://schemas.microsoft.com/office/word/2010/wordml" xmlns:w="http://schemas.openxmlformats.org/wordprocessingml/2006/main" xmlns:wne="http://schemas.microsoft.com/office/word/2006/wordml" xmlns:wp14="http://schemas.microsoft.com/office/word/2010/wordprocessingDrawing" xmlns:wp="http://schemas.openxmlformats.org/drawingml/2006/wordprocessingDrawing" xmlns:wpc="http://schemas.microsoft.com/office/word/2010/wordprocessingCanvas" xmlns:wpg="http://schemas.microsoft.com/office/word/2010/wordprocessingGroup" xmlns:wpi="http://schemas.microsoft.com/office/word/2010/wordprocessingInk" xmlns:wps="http://schemas.microsoft.com/office/word/2010/wordprocessingShape" mc:Ignorable="w14 wp14">
+  <w:p>
+    <w:pPr>
+      <w:pStyle w:val="Header"/>
+    </w:pPr>
+  </w:p>
+</w:hdr>
 </file>
 
 <file path=word/numbering.xml><?xml version="1.0" encoding="utf-8"?>
@@ -601,6 +972,14 @@
     <w:name w:val="Normal"/>
     <w:qFormat/>
     <w:rsid w:val="00FC693F"/>
+    <w:pPr>
+      <w:spacing w:after="80" w:line="271" w:lineRule="auto"/>
+    </w:pPr>
+    <w:rPr>
+      <w:rFonts w:ascii="Arial" w:hAnsi="Arial"/>
+      <w:color w:val="31363C"/>
+      <w:sz w:val="21"/>
+    </w:rPr>
   </w:style>
   <w:style w:type="paragraph" w:styleId="Header">
     <w:name w:val="header"/>
@@ -616,6 +995,11 @@
       </w:tabs>
       <w:spacing w:after="0" w:line="240" w:lineRule="auto"/>
     </w:pPr>
+    <w:rPr>
+      <w:rFonts w:ascii="Arial" w:hAnsi="Arial"/>
+      <w:color w:val="31363C"/>
+      <w:sz w:val="21"/>
+    </w:rPr>
   </w:style>
   <w:style w:type="character" w:customStyle="1" w:styleId="HeaderChar">
     <w:name w:val="Header Char"/>
@@ -638,6 +1022,11 @@
       </w:tabs>
       <w:spacing w:after="0" w:line="240" w:lineRule="auto"/>
     </w:pPr>
+    <w:rPr>
+      <w:rFonts w:ascii="Arial" w:hAnsi="Arial"/>
+      <w:color w:val="31363C"/>
+      <w:sz w:val="21"/>
+    </w:rPr>
   </w:style>
   <w:style w:type="character" w:customStyle="1" w:styleId="FooterChar">
     <w:name w:val="Footer Char"/>
@@ -661,11 +1050,11 @@
       <w:outlineLvl w:val="0"/>
     </w:pPr>
     <w:rPr>
-      <w:rFonts w:asciiTheme="majorHAnsi" w:eastAsiaTheme="majorEastAsia" w:hAnsiTheme="majorHAnsi" w:cstheme="majorBidi"/>
+      <w:rFonts w:asciiTheme="majorHAnsi" w:eastAsiaTheme="majorEastAsia" w:hAnsiTheme="majorHAnsi" w:cstheme="majorBidi" w:ascii="Arial" w:hAnsi="Arial"/>
       <w:b/>
       <w:bCs/>
-      <w:color w:val="365F91" w:themeColor="accent1" w:themeShade="BF"/>
-      <w:sz w:val="28"/>
+      <w:color w:val="30353B"/>
+      <w:sz w:val="24"/>
       <w:szCs w:val="28"/>
     </w:rPr>
   </w:style>
@@ -685,11 +1074,11 @@
       <w:outlineLvl w:val="1"/>
     </w:pPr>
     <w:rPr>
-      <w:rFonts w:asciiTheme="majorHAnsi" w:eastAsiaTheme="majorEastAsia" w:hAnsiTheme="majorHAnsi" w:cstheme="majorBidi"/>
+      <w:rFonts w:asciiTheme="majorHAnsi" w:eastAsiaTheme="majorEastAsia" w:hAnsiTheme="majorHAnsi" w:cstheme="majorBidi" w:ascii="Arial" w:hAnsi="Arial"/>
       <w:b/>
       <w:bCs/>
-      <w:color w:val="4F81BD" w:themeColor="accent1"/>
-      <w:sz w:val="26"/>
+      <w:color w:val="30353B"/>
+      <w:sz w:val="22"/>
       <w:szCs w:val="26"/>
     </w:rPr>
   </w:style>
@@ -709,10 +1098,11 @@
       <w:outlineLvl w:val="2"/>
     </w:pPr>
     <w:rPr>
-      <w:rFonts w:asciiTheme="majorHAnsi" w:eastAsiaTheme="majorEastAsia" w:hAnsiTheme="majorHAnsi" w:cstheme="majorBidi"/>
+      <w:rFonts w:asciiTheme="majorHAnsi" w:eastAsiaTheme="majorEastAsia" w:hAnsiTheme="majorHAnsi" w:cstheme="majorBidi" w:ascii="Arial" w:hAnsi="Arial"/>
       <w:b/>
       <w:bCs/>
-      <w:color w:val="4F81BD" w:themeColor="accent1"/>
+      <w:color w:val="31363C"/>
+      <w:sz w:val="21"/>
     </w:rPr>
   </w:style>
   <w:style w:type="paragraph" w:styleId="Heading4">
@@ -732,12 +1122,13 @@
       <w:outlineLvl w:val="3"/>
     </w:pPr>
     <w:rPr>
-      <w:rFonts w:asciiTheme="majorHAnsi" w:eastAsiaTheme="majorEastAsia" w:hAnsiTheme="majorHAnsi" w:cstheme="majorBidi"/>
+      <w:rFonts w:asciiTheme="majorHAnsi" w:eastAsiaTheme="majorEastAsia" w:hAnsiTheme="majorHAnsi" w:cstheme="majorBidi" w:ascii="Arial" w:hAnsi="Arial"/>
       <w:b/>
       <w:bCs/>
       <w:i/>
       <w:iCs/>
-      <w:color w:val="4F81BD" w:themeColor="accent1"/>
+      <w:color w:val="31363C"/>
+      <w:sz w:val="21"/>
     </w:rPr>
   </w:style>
   <w:style w:type="paragraph" w:styleId="Heading5">
@@ -757,8 +1148,9 @@
       <w:outlineLvl w:val="4"/>
     </w:pPr>
     <w:rPr>
-      <w:rFonts w:asciiTheme="majorHAnsi" w:eastAsiaTheme="majorEastAsia" w:hAnsiTheme="majorHAnsi" w:cstheme="majorBidi"/>
-      <w:color w:val="243F60" w:themeColor="accent1" w:themeShade="7F"/>
+      <w:rFonts w:asciiTheme="majorHAnsi" w:eastAsiaTheme="majorEastAsia" w:hAnsiTheme="majorHAnsi" w:cstheme="majorBidi" w:ascii="Arial" w:hAnsi="Arial"/>
+      <w:color w:val="31363C"/>
+      <w:sz w:val="21"/>
     </w:rPr>
   </w:style>
   <w:style w:type="paragraph" w:styleId="Heading6">
@@ -778,10 +1170,11 @@
       <w:outlineLvl w:val="5"/>
     </w:pPr>
     <w:rPr>
-      <w:rFonts w:asciiTheme="majorHAnsi" w:eastAsiaTheme="majorEastAsia" w:hAnsiTheme="majorHAnsi" w:cstheme="majorBidi"/>
+      <w:rFonts w:asciiTheme="majorHAnsi" w:eastAsiaTheme="majorEastAsia" w:hAnsiTheme="majorHAnsi" w:cstheme="majorBidi" w:ascii="Arial" w:hAnsi="Arial"/>
       <w:i/>
       <w:iCs/>
-      <w:color w:val="243F60" w:themeColor="accent1" w:themeShade="7F"/>
+      <w:color w:val="31363C"/>
+      <w:sz w:val="21"/>
     </w:rPr>
   </w:style>
   <w:style w:type="paragraph" w:styleId="Heading7">
@@ -801,10 +1194,11 @@
       <w:outlineLvl w:val="6"/>
     </w:pPr>
     <w:rPr>
-      <w:rFonts w:asciiTheme="majorHAnsi" w:eastAsiaTheme="majorEastAsia" w:hAnsiTheme="majorHAnsi" w:cstheme="majorBidi"/>
+      <w:rFonts w:asciiTheme="majorHAnsi" w:eastAsiaTheme="majorEastAsia" w:hAnsiTheme="majorHAnsi" w:cstheme="majorBidi" w:ascii="Arial" w:hAnsi="Arial"/>
       <w:i/>
       <w:iCs/>
-      <w:color w:val="404040" w:themeColor="text1" w:themeTint="BF"/>
+      <w:color w:val="31363C"/>
+      <w:sz w:val="21"/>
     </w:rPr>
   </w:style>
   <w:style w:type="paragraph" w:styleId="Heading8">
@@ -824,9 +1218,9 @@
       <w:outlineLvl w:val="7"/>
     </w:pPr>
     <w:rPr>
-      <w:rFonts w:asciiTheme="majorHAnsi" w:eastAsiaTheme="majorEastAsia" w:hAnsiTheme="majorHAnsi" w:cstheme="majorBidi"/>
-      <w:color w:val="4F81BD" w:themeColor="accent1"/>
-      <w:sz w:val="20"/>
+      <w:rFonts w:asciiTheme="majorHAnsi" w:eastAsiaTheme="majorEastAsia" w:hAnsiTheme="majorHAnsi" w:cstheme="majorBidi" w:ascii="Arial" w:hAnsi="Arial"/>
+      <w:color w:val="31363C"/>
+      <w:sz w:val="21"/>
       <w:szCs w:val="20"/>
     </w:rPr>
   </w:style>
@@ -847,11 +1241,11 @@
       <w:outlineLvl w:val="8"/>
     </w:pPr>
     <w:rPr>
-      <w:rFonts w:asciiTheme="majorHAnsi" w:eastAsiaTheme="majorEastAsia" w:hAnsiTheme="majorHAnsi" w:cstheme="majorBidi"/>
+      <w:rFonts w:asciiTheme="majorHAnsi" w:eastAsiaTheme="majorEastAsia" w:hAnsiTheme="majorHAnsi" w:cstheme="majorBidi" w:ascii="Arial" w:hAnsi="Arial"/>
       <w:i/>
       <w:iCs/>
-      <w:color w:val="404040" w:themeColor="text1" w:themeTint="BF"/>
-      <w:sz w:val="20"/>
+      <w:color w:val="31363C"/>
+      <w:sz w:val="21"/>
       <w:szCs w:val="20"/>
     </w:rPr>
   </w:style>
@@ -890,6 +1284,11 @@
     <w:pPr>
       <w:spacing w:after="0" w:line="240" w:lineRule="auto"/>
     </w:pPr>
+    <w:rPr>
+      <w:rFonts w:ascii="Arial" w:hAnsi="Arial"/>
+      <w:color w:val="31363C"/>
+      <w:sz w:val="21"/>
+    </w:rPr>
   </w:style>
   <w:style w:type="character" w:customStyle="1" w:styleId="Heading1Char">
     <w:name w:val="Heading 1 Char"/>
@@ -950,11 +1349,12 @@
       <w:contextualSpacing/>
     </w:pPr>
     <w:rPr>
-      <w:rFonts w:asciiTheme="majorHAnsi" w:eastAsiaTheme="majorEastAsia" w:hAnsiTheme="majorHAnsi" w:cstheme="majorBidi"/>
-      <w:color w:val="17365D" w:themeColor="text2" w:themeShade="BF"/>
+      <w:rFonts w:asciiTheme="majorHAnsi" w:eastAsiaTheme="majorEastAsia" w:hAnsiTheme="majorHAnsi" w:cstheme="majorBidi" w:ascii="Arial" w:hAnsi="Arial"/>
+      <w:b/>
+      <w:color w:val="30353B"/>
       <w:spacing w:val="5"/>
       <w:kern w:val="28"/>
-      <w:sz w:val="52"/>
+      <w:sz w:val="30"/>
       <w:szCs w:val="52"/>
     </w:rPr>
   </w:style>
@@ -987,12 +1387,12 @@
       </w:numPr>
     </w:pPr>
     <w:rPr>
-      <w:rFonts w:asciiTheme="majorHAnsi" w:eastAsiaTheme="majorEastAsia" w:hAnsiTheme="majorHAnsi" w:cstheme="majorBidi"/>
+      <w:rFonts w:asciiTheme="majorHAnsi" w:eastAsiaTheme="majorEastAsia" w:hAnsiTheme="majorHAnsi" w:cstheme="majorBidi" w:ascii="Arial" w:hAnsi="Arial"/>
       <w:i/>
       <w:iCs/>
-      <w:color w:val="4F81BD" w:themeColor="accent1"/>
+      <w:color w:val="31363C"/>
       <w:spacing w:val="15"/>
-      <w:sz w:val="24"/>
+      <w:sz w:val="21"/>
       <w:szCs w:val="24"/>
     </w:rPr>
   </w:style>
@@ -1022,6 +1422,11 @@
       <w:ind w:left="720"/>
       <w:contextualSpacing/>
     </w:pPr>
+    <w:rPr>
+      <w:rFonts w:ascii="Arial" w:hAnsi="Arial"/>
+      <w:color w:val="31363C"/>
+      <w:sz w:val="21"/>
+    </w:rPr>
   </w:style>
   <w:style w:type="paragraph" w:styleId="BodyText">
     <w:name w:val="Body Text"/>
@@ -1033,6 +1438,11 @@
     <w:pPr>
       <w:spacing w:after="120"/>
     </w:pPr>
+    <w:rPr>
+      <w:rFonts w:ascii="Arial" w:hAnsi="Arial"/>
+      <w:color w:val="31363C"/>
+      <w:sz w:val="21"/>
+    </w:rPr>
   </w:style>
   <w:style w:type="character" w:customStyle="1" w:styleId="BodyTextChar">
     <w:name w:val="Body Text Char"/>
@@ -1051,6 +1461,11 @@
     <w:pPr>
       <w:spacing w:after="120" w:line="480" w:lineRule="auto"/>
     </w:pPr>
+    <w:rPr>
+      <w:rFonts w:ascii="Arial" w:hAnsi="Arial"/>
+      <w:color w:val="31363C"/>
+      <w:sz w:val="21"/>
+    </w:rPr>
   </w:style>
   <w:style w:type="character" w:customStyle="1" w:styleId="BodyText2Char">
     <w:name w:val="Body Text 2 Char"/>
@@ -1070,7 +1485,9 @@
       <w:spacing w:after="120"/>
     </w:pPr>
     <w:rPr>
-      <w:sz w:val="16"/>
+      <w:rFonts w:ascii="Arial" w:hAnsi="Arial"/>
+      <w:color w:val="31363C"/>
+      <w:sz w:val="21"/>
       <w:szCs w:val="16"/>
     </w:rPr>
   </w:style>
@@ -1095,6 +1512,11 @@
       <w:ind w:left="360" w:hanging="360"/>
       <w:contextualSpacing/>
     </w:pPr>
+    <w:rPr>
+      <w:rFonts w:ascii="Arial" w:hAnsi="Arial"/>
+      <w:color w:val="31363C"/>
+      <w:sz w:val="21"/>
+    </w:rPr>
   </w:style>
   <w:style w:type="paragraph" w:styleId="List2">
     <w:name w:val="List 2"/>
@@ -1106,6 +1528,11 @@
       <w:ind w:left="720" w:hanging="360"/>
       <w:contextualSpacing/>
     </w:pPr>
+    <w:rPr>
+      <w:rFonts w:ascii="Arial" w:hAnsi="Arial"/>
+      <w:color w:val="31363C"/>
+      <w:sz w:val="21"/>
+    </w:rPr>
   </w:style>
   <w:style w:type="paragraph" w:styleId="List3">
     <w:name w:val="List 3"/>
@@ -1117,6 +1544,11 @@
       <w:ind w:left="1080" w:hanging="360"/>
       <w:contextualSpacing/>
     </w:pPr>
+    <w:rPr>
+      <w:rFonts w:ascii="Arial" w:hAnsi="Arial"/>
+      <w:color w:val="31363C"/>
+      <w:sz w:val="21"/>
+    </w:rPr>
   </w:style>
   <w:style w:type="paragraph" w:styleId="ListBullet">
     <w:name w:val="List Bullet"/>
@@ -1130,6 +1562,11 @@
       </w:numPr>
       <w:contextualSpacing/>
     </w:pPr>
+    <w:rPr>
+      <w:rFonts w:ascii="Arial" w:hAnsi="Arial"/>
+      <w:color w:val="31363C"/>
+      <w:sz w:val="21"/>
+    </w:rPr>
   </w:style>
   <w:style w:type="paragraph" w:styleId="ListBullet2">
     <w:name w:val="List Bullet 2"/>
@@ -1143,6 +1580,11 @@
       </w:numPr>
       <w:contextualSpacing/>
     </w:pPr>
+    <w:rPr>
+      <w:rFonts w:ascii="Arial" w:hAnsi="Arial"/>
+      <w:color w:val="31363C"/>
+      <w:sz w:val="21"/>
+    </w:rPr>
   </w:style>
   <w:style w:type="paragraph" w:styleId="ListBullet3">
     <w:name w:val="List Bullet 3"/>
@@ -1156,6 +1598,11 @@
       </w:numPr>
       <w:contextualSpacing/>
     </w:pPr>
+    <w:rPr>
+      <w:rFonts w:ascii="Arial" w:hAnsi="Arial"/>
+      <w:color w:val="31363C"/>
+      <w:sz w:val="21"/>
+    </w:rPr>
   </w:style>
   <w:style w:type="paragraph" w:styleId="ListNumber">
     <w:name w:val="List Number"/>
@@ -1169,6 +1616,11 @@
       </w:numPr>
       <w:contextualSpacing/>
     </w:pPr>
+    <w:rPr>
+      <w:rFonts w:ascii="Arial" w:hAnsi="Arial"/>
+      <w:color w:val="31363C"/>
+      <w:sz w:val="21"/>
+    </w:rPr>
   </w:style>
   <w:style w:type="paragraph" w:styleId="ListNumber2">
     <w:name w:val="List Number 2"/>
@@ -1182,6 +1634,11 @@
       </w:numPr>
       <w:contextualSpacing/>
     </w:pPr>
+    <w:rPr>
+      <w:rFonts w:ascii="Arial" w:hAnsi="Arial"/>
+      <w:color w:val="31363C"/>
+      <w:sz w:val="21"/>
+    </w:rPr>
   </w:style>
   <w:style w:type="paragraph" w:styleId="ListNumber3">
     <w:name w:val="List Number 3"/>
@@ -1195,6 +1652,11 @@
       </w:numPr>
       <w:contextualSpacing/>
     </w:pPr>
+    <w:rPr>
+      <w:rFonts w:ascii="Arial" w:hAnsi="Arial"/>
+      <w:color w:val="31363C"/>
+      <w:sz w:val="21"/>
+    </w:rPr>
   </w:style>
   <w:style w:type="paragraph" w:styleId="ListContinue">
     <w:name w:val="List Continue"/>
@@ -1207,6 +1669,11 @@
       <w:ind w:left="360"/>
       <w:contextualSpacing/>
     </w:pPr>
+    <w:rPr>
+      <w:rFonts w:ascii="Arial" w:hAnsi="Arial"/>
+      <w:color w:val="31363C"/>
+      <w:sz w:val="21"/>
+    </w:rPr>
   </w:style>
   <w:style w:type="paragraph" w:styleId="ListContinue2">
     <w:name w:val="List Continue 2"/>
@@ -1219,6 +1686,11 @@
       <w:ind w:left="720"/>
       <w:contextualSpacing/>
     </w:pPr>
+    <w:rPr>
+      <w:rFonts w:ascii="Arial" w:hAnsi="Arial"/>
+      <w:color w:val="31363C"/>
+      <w:sz w:val="21"/>
+    </w:rPr>
   </w:style>
   <w:style w:type="paragraph" w:styleId="ListContinue3">
     <w:name w:val="List Continue 3"/>
@@ -1231,6 +1703,11 @@
       <w:ind w:left="1080"/>
       <w:contextualSpacing/>
     </w:pPr>
+    <w:rPr>
+      <w:rFonts w:ascii="Arial" w:hAnsi="Arial"/>
+      <w:color w:val="31363C"/>
+      <w:sz w:val="21"/>
+    </w:rPr>
   </w:style>
   <w:style w:type="paragraph" w:styleId="MacroText">
     <w:name w:val="macro"/>
@@ -1250,8 +1727,9 @@
       </w:tabs>
     </w:pPr>
     <w:rPr>
-      <w:rFonts w:ascii="Courier" w:hAnsi="Courier"/>
-      <w:sz w:val="20"/>
+      <w:rFonts w:ascii="Arial" w:hAnsi="Arial"/>
+      <w:color w:val="31363C"/>
+      <w:sz w:val="21"/>
       <w:szCs w:val="20"/>
     </w:rPr>
   </w:style>
@@ -1276,9 +1754,11 @@
     <w:qFormat/>
     <w:rsid w:val="00FC693F"/>
     <w:rPr>
+      <w:rFonts w:ascii="Arial" w:hAnsi="Arial"/>
       <w:i/>
       <w:iCs/>
-      <w:color w:val="000000" w:themeColor="text1"/>
+      <w:color w:val="31363C"/>
+      <w:sz w:val="21"/>
     </w:rPr>
   </w:style>
   <w:style w:type="character" w:customStyle="1" w:styleId="QuoteChar">
@@ -1392,10 +1872,11 @@
       <w:spacing w:line="240" w:lineRule="auto"/>
     </w:pPr>
     <w:rPr>
+      <w:rFonts w:ascii="Arial" w:hAnsi="Arial"/>
       <w:b/>
       <w:bCs/>
-      <w:color w:val="4F81BD" w:themeColor="accent1"/>
-      <w:sz w:val="18"/>
+      <w:color w:val="31363C"/>
+      <w:sz w:val="21"/>
       <w:szCs w:val="18"/>
     </w:rPr>
   </w:style>
@@ -1437,11 +1918,13 @@
       <w:ind w:left="936" w:right="936"/>
     </w:pPr>
     <w:rPr>
+      <w:rFonts w:ascii="Arial" w:hAnsi="Arial"/>
       <w:b/>
       <w:bCs/>
       <w:i/>
       <w:iCs/>
-      <w:color w:val="4F81BD" w:themeColor="accent1"/>
+      <w:color w:val="31363C"/>
+      <w:sz w:val="21"/>
     </w:rPr>
   </w:style>
   <w:style w:type="character" w:customStyle="1" w:styleId="IntenseQuoteChar">
@@ -1536,6 +2019,11 @@
     <w:pPr>
       <w:outlineLvl w:val="9"/>
     </w:pPr>
+    <w:rPr>
+      <w:rFonts w:ascii="Arial" w:hAnsi="Arial"/>
+      <w:color w:val="31363C"/>
+      <w:sz w:val="21"/>
+    </w:rPr>
   </w:style>
   <w:style w:type="table" w:styleId="TableGrid">
     <w:name w:val="Table Grid"/>

</xml_diff>